<commit_message>
Add short homepage design and designer update brief
- landing-page/NXT_homepage_short.html: 5-block homepage, form on the
  first screen, 5 CTAs to the form + Open Day as the soft path, sticky
  mobile bar, ?angle= hero per ad; desktop/mobile renders + CTA map
- design-briefs/Brief_UPDATE_website_alignment.docx: one page for the
  designer with old -> new text per creative and due dates
- Batch briefs 1-4: UPDATED line on each affected card, website facts
  rule; stale "date to confirm" notes removed
- Old /prijava/ prototype and the LP review moved to archive

Co-Authored-By: Claude Opus 5.5 <noreply@anthropic.com>
Claude-Session: https://claude.ai/code/session_01WYxT2oKqHUxfsBrXZ2Myb2
</commit_message>
<xml_diff>
--- a/nxt-school-launch/design-briefs/Brief_Batch1_W1_launch.docx
+++ b/nxt-school-launch/design-briefs/Brief_Batch1_W1_launch.docx
@@ -858,7 +858,7 @@
     </w:tbl>
     <w:p>
       <w:pPr>
-        <w:spacing w:after="80"/>
+        <w:spacing w:after="50"/>
       </w:pPr>
     </w:p>
     <w:tbl>
@@ -1018,6 +1018,31 @@
                 <w:sz w:val="13"/>
                 <w:szCs w:val="13"/>
               </w:rPr>
+              <w:t xml:space="preserve">Facts = the website:</w:t>
+            </w:r>
+            <w:r>
+              <w:rPr>
+                <w:rFonts w:ascii="Arial" w:cs="Arial" w:eastAsia="Arial" w:hAnsi="Arial"/>
+                <w:color w:val="1E293B"/>
+                <w:sz w:val="13"/>
+                <w:szCs w:val="13"/>
+              </w:rPr>
+              <w:t xml:space="preserve"> regular 7.200 RSD · Open Day ponedeljak, 26. oktobar, 18–20 h · no "besplatno" until confirmed · level copy + "6 oblasti" as on the site.</w:t>
+            </w:r>
+          </w:p>
+          <w:p>
+            <w:pPr>
+              <w:spacing w:after="18" w:before="0" w:line="222"/>
+            </w:pPr>
+            <w:r>
+              <w:rPr>
+                <w:rFonts w:ascii="Arial" w:cs="Arial" w:eastAsia="Arial" w:hAnsi="Arial"/>
+                <w:b/>
+                <w:bCs/>
+                <w:color w:val="1E293B"/>
+                <w:sz w:val="13"/>
+                <w:szCs w:val="13"/>
+              </w:rPr>
               <w:t xml:space="preserve">Never:</w:t>
             </w:r>
             <w:r>
@@ -1027,7 +1052,7 @@
                 <w:sz w:val="13"/>
                 <w:szCs w:val="13"/>
               </w:rPr>
-              <w:t xml:space="preserve"> AI-generated children’s faces · rows of kids staring at screens · "Demo Day" (it’s NXT Showcase) · "mesta ograničena" without a real seat count. Any real child photo needs signed parental consent.</w:t>
+              <w:t xml:space="preserve"> AI-generated children’s faces · rows of kids staring at screens · "Demo Day" (it’s NXT Showcase) · seat counts (the site’s "Broj mesta je ograničen" is fine). Real child photos need signed parental consent.</w:t>
             </w:r>
           </w:p>
           <w:p>
@@ -1080,7 +1105,7 @@
     </w:tbl>
     <w:p>
       <w:pPr>
-        <w:spacing w:after="100"/>
+        <w:spacing w:after="60"/>
       </w:pPr>
     </w:p>
     <w:tbl>
@@ -1584,7 +1609,7 @@
     </w:tbl>
     <w:p>
       <w:pPr>
-        <w:spacing w:after="120"/>
+        <w:spacing w:after="80"/>
       </w:pPr>
     </w:p>
     <w:tbl>
@@ -2124,7 +2149,7 @@
     </w:tbl>
     <w:p>
       <w:pPr>
-        <w:spacing w:after="120"/>
+        <w:spacing w:after="80"/>
       </w:pPr>
     </w:p>
     <w:tbl>
@@ -2617,7 +2642,7 @@
     </w:tbl>
     <w:p>
       <w:pPr>
-        <w:spacing w:after="120"/>
+        <w:spacing w:after="80"/>
       </w:pPr>
     </w:p>
     <w:tbl>
@@ -3096,7 +3121,7 @@
     </w:tbl>
     <w:p>
       <w:pPr>
-        <w:spacing w:after="120"/>
+        <w:spacing w:after="80"/>
       </w:pPr>
     </w:p>
     <w:tbl>
@@ -3353,6 +3378,41 @@
           </w:p>
           <w:p>
             <w:pPr>
+              <w:shd w:fill="FFE4EC" w:color="auto" w:val="clear"/>
+              <w:spacing w:after="60"/>
+            </w:pPr>
+            <w:r>
+              <w:rPr>
+                <w:rFonts w:ascii="Arial" w:cs="Arial" w:eastAsia="Arial" w:hAnsi="Arial"/>
+                <w:color w:val="9F1239"/>
+                <w:sz w:val="14"/>
+                <w:szCs w:val="14"/>
+              </w:rPr>
+              <w:t xml:space="preserve">UPDATED 6 OCT (website) · regular price is </w:t>
+            </w:r>
+            <w:r>
+              <w:rPr>
+                <w:rFonts w:ascii="Arial" w:cs="Arial" w:eastAsia="Arial" w:hAnsi="Arial"/>
+                <w:b/>
+                <w:bCs/>
+                <w:color w:val="9F1239"/>
+                <w:sz w:val="14"/>
+                <w:szCs w:val="14"/>
+              </w:rPr>
+              <w:t xml:space="preserve">7.200 RSD</w:t>
+            </w:r>
+            <w:r>
+              <w:rPr>
+                <w:rFonts w:ascii="Arial" w:cs="Arial" w:eastAsia="Arial" w:hAnsi="Arial"/>
+                <w:color w:val="9F1239"/>
+                <w:sz w:val="14"/>
+                <w:szCs w:val="14"/>
+              </w:rPr>
+              <w:t xml:space="preserve"> (was 6.400) — fix the file that went live today.</w:t>
+            </w:r>
+          </w:p>
+          <w:p>
+            <w:pPr>
               <w:spacing w:after="25" w:before="0" w:line="222"/>
             </w:pPr>
             <w:r>
@@ -3575,7 +3635,7 @@
     </w:tbl>
     <w:p>
       <w:pPr>
-        <w:spacing w:after="120"/>
+        <w:spacing w:after="80"/>
       </w:pPr>
     </w:p>
     <w:sectPr>

</xml_diff>